<commit_message>
added the new txt
</commit_message>
<xml_diff>
--- a/midterm lab.docx
+++ b/midterm lab.docx
@@ -39,19 +39,11 @@
           <w:rFonts w:ascii="Times New Roman" w:hAnsi="Times New Roman" w:cs="Times New Roman"/>
         </w:rPr>
       </w:pPr>
-      <w:proofErr w:type="gramStart"/>
-      <w:r>
-        <w:rPr>
-          <w:rFonts w:ascii="Times New Roman" w:hAnsi="Times New Roman" w:cs="Times New Roman"/>
-        </w:rPr>
-        <w:t>Department  --</w:t>
-      </w:r>
-      <w:proofErr w:type="gramEnd"/>
-      <w:r>
-        <w:rPr>
-          <w:rFonts w:ascii="Times New Roman" w:hAnsi="Times New Roman" w:cs="Times New Roman"/>
-        </w:rPr>
-        <w:t>&gt;   Computer Science</w:t>
+      <w:r>
+        <w:rPr>
+          <w:rFonts w:ascii="Times New Roman" w:hAnsi="Times New Roman" w:cs="Times New Roman"/>
+        </w:rPr>
+        <w:t>Department  --&gt;   Computer Science</w:t>
       </w:r>
     </w:p>
     <w:p>
@@ -69,19 +61,11 @@
           <w:rFonts w:ascii="Times New Roman" w:hAnsi="Times New Roman" w:cs="Times New Roman"/>
         </w:rPr>
       </w:pPr>
-      <w:proofErr w:type="gramStart"/>
-      <w:r>
-        <w:rPr>
-          <w:rFonts w:ascii="Times New Roman" w:hAnsi="Times New Roman" w:cs="Times New Roman"/>
-        </w:rPr>
-        <w:t>Name :</w:t>
-      </w:r>
-      <w:proofErr w:type="gramEnd"/>
-      <w:r>
-        <w:rPr>
-          <w:rFonts w:ascii="Times New Roman" w:hAnsi="Times New Roman" w:cs="Times New Roman"/>
-        </w:rPr>
-        <w:t xml:space="preserve"> Hafiz Umer Shaban</w:t>
+      <w:r>
+        <w:rPr>
+          <w:rFonts w:ascii="Times New Roman" w:hAnsi="Times New Roman" w:cs="Times New Roman"/>
+        </w:rPr>
+        <w:t>Name : Hafiz Umer Shaban</w:t>
       </w:r>
     </w:p>
     <w:p>
@@ -95,21 +79,7 @@
         <w:rPr>
           <w:rFonts w:ascii="Times New Roman" w:hAnsi="Times New Roman" w:cs="Times New Roman"/>
         </w:rPr>
-        <w:t xml:space="preserve">Roll </w:t>
-      </w:r>
-      <w:proofErr w:type="gramStart"/>
-      <w:r>
-        <w:rPr>
-          <w:rFonts w:ascii="Times New Roman" w:hAnsi="Times New Roman" w:cs="Times New Roman"/>
-        </w:rPr>
-        <w:t>No :</w:t>
-      </w:r>
-      <w:proofErr w:type="gramEnd"/>
-      <w:r>
-        <w:rPr>
-          <w:rFonts w:ascii="Times New Roman" w:hAnsi="Times New Roman" w:cs="Times New Roman"/>
-        </w:rPr>
-        <w:t xml:space="preserve"> FA23-BCS-056</w:t>
+        <w:t>Roll No : FA23-BCS-056</w:t>
       </w:r>
     </w:p>
     <w:p>
@@ -284,7 +254,6 @@
         <w:t xml:space="preserve"> </w:t>
       </w:r>
       <w:proofErr w:type="spellStart"/>
-      <w:proofErr w:type="gramStart"/>
       <w:r>
         <w:rPr>
           <w:rFonts w:ascii="Times New Roman" w:hAnsi="Times New Roman" w:cs="Times New Roman"/>
@@ -295,7 +264,6 @@
         <w:t>Mid term</w:t>
       </w:r>
       <w:proofErr w:type="spellEnd"/>
-      <w:proofErr w:type="gramEnd"/>
       <w:r>
         <w:rPr>
           <w:rFonts w:ascii="Times New Roman" w:hAnsi="Times New Roman" w:cs="Times New Roman"/>
@@ -359,11 +327,14 @@
     </w:p>
     <w:p>
       <w:r>
+        <w:rPr>
+          <w:noProof/>
+        </w:rPr>
         <w:drawing>
-          <wp:inline distT="0" distB="0" distL="0" distR="0" wp14:anchorId="33AF2CC8" wp14:editId="01F99386">
-            <wp:extent cx="5943600" cy="3105150"/>
-            <wp:effectExtent l="0" t="0" r="0" b="0"/>
-            <wp:docPr id="603377043" name="Picture 1"/>
+          <wp:inline distT="0" distB="0" distL="0" distR="0" wp14:anchorId="6AC0A41C" wp14:editId="2B62897E">
+            <wp:extent cx="5943600" cy="2828925"/>
+            <wp:effectExtent l="0" t="0" r="0" b="9525"/>
+            <wp:docPr id="66862408" name="Picture 1"/>
             <wp:cNvGraphicFramePr>
               <a:graphicFrameLocks xmlns:a="http://schemas.openxmlformats.org/drawingml/2006/main" noChangeAspect="1"/>
             </wp:cNvGraphicFramePr>
@@ -371,7 +342,7 @@
               <a:graphicData uri="http://schemas.openxmlformats.org/drawingml/2006/picture">
                 <pic:pic xmlns:pic="http://schemas.openxmlformats.org/drawingml/2006/picture">
                   <pic:nvPicPr>
-                    <pic:cNvPr id="603377043" name=""/>
+                    <pic:cNvPr id="66862408" name=""/>
                     <pic:cNvPicPr/>
                   </pic:nvPicPr>
                   <pic:blipFill>
@@ -383,7 +354,7 @@
                   <pic:spPr>
                     <a:xfrm>
                       <a:off x="0" y="0"/>
-                      <a:ext cx="5943600" cy="3105150"/>
+                      <a:ext cx="5943600" cy="2828925"/>
                     </a:xfrm>
                     <a:prstGeom prst="rect">
                       <a:avLst/>
@@ -471,12 +442,15 @@
     </w:p>
     <w:p>
       <w:r>
+        <w:rPr>
+          <w:noProof/>
+        </w:rPr>
         <w:lastRenderedPageBreak/>
         <w:drawing>
-          <wp:inline distT="0" distB="0" distL="0" distR="0" wp14:anchorId="2DE493B7" wp14:editId="2035315C">
-            <wp:extent cx="5943600" cy="3361055"/>
-            <wp:effectExtent l="0" t="0" r="0" b="0"/>
-            <wp:docPr id="1617624893" name="Picture 1"/>
+          <wp:inline distT="0" distB="0" distL="0" distR="0" wp14:anchorId="5C33F90F" wp14:editId="71D16730">
+            <wp:extent cx="5943600" cy="3330575"/>
+            <wp:effectExtent l="0" t="0" r="0" b="3175"/>
+            <wp:docPr id="900131076" name="Picture 1"/>
             <wp:cNvGraphicFramePr>
               <a:graphicFrameLocks xmlns:a="http://schemas.openxmlformats.org/drawingml/2006/main" noChangeAspect="1"/>
             </wp:cNvGraphicFramePr>
@@ -484,7 +458,7 @@
               <a:graphicData uri="http://schemas.openxmlformats.org/drawingml/2006/picture">
                 <pic:pic xmlns:pic="http://schemas.openxmlformats.org/drawingml/2006/picture">
                   <pic:nvPicPr>
-                    <pic:cNvPr id="1617624893" name=""/>
+                    <pic:cNvPr id="900131076" name=""/>
                     <pic:cNvPicPr/>
                   </pic:nvPicPr>
                   <pic:blipFill>
@@ -496,7 +470,7 @@
                   <pic:spPr>
                     <a:xfrm>
                       <a:off x="0" y="0"/>
-                      <a:ext cx="5943600" cy="3361055"/>
+                      <a:ext cx="5943600" cy="3330575"/>
                     </a:xfrm>
                     <a:prstGeom prst="rect">
                       <a:avLst/>
@@ -510,7 +484,6 @@
       </w:r>
     </w:p>
     <w:p>
-      <w:proofErr w:type="gramStart"/>
       <w:r>
         <w:rPr>
           <w:rFonts w:ascii="Times New Roman" w:hAnsi="Times New Roman" w:cs="Times New Roman"/>
@@ -525,7 +498,6 @@
       <w:r>
         <w:t xml:space="preserve"> :</w:t>
       </w:r>
-      <w:proofErr w:type="gramEnd"/>
       <w:r>
         <w:t xml:space="preserve"> </w:t>
       </w:r>
@@ -573,12 +545,15 @@
     <w:p/>
     <w:p>
       <w:r>
+        <w:rPr>
+          <w:noProof/>
+        </w:rPr>
         <w:lastRenderedPageBreak/>
         <w:drawing>
-          <wp:inline distT="0" distB="0" distL="0" distR="0" wp14:anchorId="65AB1770" wp14:editId="0A6FF24C">
-            <wp:extent cx="5943600" cy="3089275"/>
-            <wp:effectExtent l="0" t="0" r="0" b="0"/>
-            <wp:docPr id="706261708" name="Picture 1"/>
+          <wp:inline distT="0" distB="0" distL="0" distR="0" wp14:anchorId="4554607E" wp14:editId="46F58823">
+            <wp:extent cx="5943600" cy="3253740"/>
+            <wp:effectExtent l="0" t="0" r="0" b="3810"/>
+            <wp:docPr id="1428759077" name="Picture 1"/>
             <wp:cNvGraphicFramePr>
               <a:graphicFrameLocks xmlns:a="http://schemas.openxmlformats.org/drawingml/2006/main" noChangeAspect="1"/>
             </wp:cNvGraphicFramePr>
@@ -586,7 +561,7 @@
               <a:graphicData uri="http://schemas.openxmlformats.org/drawingml/2006/picture">
                 <pic:pic xmlns:pic="http://schemas.openxmlformats.org/drawingml/2006/picture">
                   <pic:nvPicPr>
-                    <pic:cNvPr id="706261708" name=""/>
+                    <pic:cNvPr id="1428759077" name=""/>
                     <pic:cNvPicPr/>
                   </pic:nvPicPr>
                   <pic:blipFill>
@@ -598,7 +573,7 @@
                   <pic:spPr>
                     <a:xfrm>
                       <a:off x="0" y="0"/>
-                      <a:ext cx="5943600" cy="3089275"/>
+                      <a:ext cx="5943600" cy="3253740"/>
                     </a:xfrm>
                     <a:prstGeom prst="rect">
                       <a:avLst/>
@@ -612,7 +587,6 @@
       </w:r>
     </w:p>
     <w:p>
-      <w:proofErr w:type="gramStart"/>
       <w:r>
         <w:rPr>
           <w:rFonts w:ascii="Times New Roman" w:hAnsi="Times New Roman" w:cs="Times New Roman"/>
@@ -625,11 +599,7 @@
         <w:t>Link</w:t>
       </w:r>
       <w:r>
-        <w:t xml:space="preserve"> :</w:t>
-      </w:r>
-      <w:proofErr w:type="gramEnd"/>
-      <w:r>
-        <w:t xml:space="preserve"> </w:t>
+        <w:t xml:space="preserve"> : </w:t>
       </w:r>
       <w:r>
         <w:t>http://localhost:5000</w:t>
@@ -661,11 +631,14 @@
     </w:p>
     <w:p>
       <w:r>
+        <w:rPr>
+          <w:noProof/>
+        </w:rPr>
         <w:drawing>
-          <wp:inline distT="0" distB="0" distL="0" distR="0" wp14:anchorId="04B77B60" wp14:editId="1ED938BF">
-            <wp:extent cx="5943600" cy="1358265"/>
+          <wp:inline distT="0" distB="0" distL="0" distR="0" wp14:anchorId="6D30F58E" wp14:editId="4E961FF9">
+            <wp:extent cx="5943600" cy="1151890"/>
             <wp:effectExtent l="0" t="0" r="0" b="0"/>
-            <wp:docPr id="935096409" name="Picture 1"/>
+            <wp:docPr id="1598236298" name="Picture 1"/>
             <wp:cNvGraphicFramePr>
               <a:graphicFrameLocks xmlns:a="http://schemas.openxmlformats.org/drawingml/2006/main" noChangeAspect="1"/>
             </wp:cNvGraphicFramePr>
@@ -673,7 +646,7 @@
               <a:graphicData uri="http://schemas.openxmlformats.org/drawingml/2006/picture">
                 <pic:pic xmlns:pic="http://schemas.openxmlformats.org/drawingml/2006/picture">
                   <pic:nvPicPr>
-                    <pic:cNvPr id="935096409" name=""/>
+                    <pic:cNvPr id="1598236298" name=""/>
                     <pic:cNvPicPr/>
                   </pic:nvPicPr>
                   <pic:blipFill>
@@ -685,7 +658,7 @@
                   <pic:spPr>
                     <a:xfrm>
                       <a:off x="0" y="0"/>
-                      <a:ext cx="5943600" cy="1358265"/>
+                      <a:ext cx="5943600" cy="1151890"/>
                     </a:xfrm>
                     <a:prstGeom prst="rect">
                       <a:avLst/>
@@ -703,12 +676,10 @@
         <w:t xml:space="preserve">Image Name: </w:t>
       </w:r>
       <w:proofErr w:type="spellStart"/>
-      <w:proofErr w:type="gramStart"/>
       <w:r>
         <w:t>mydevopsapp:latest</w:t>
       </w:r>
       <w:proofErr w:type="spellEnd"/>
-      <w:proofErr w:type="gramEnd"/>
     </w:p>
     <w:p>
       <w:r>
@@ -723,12 +694,10 @@
         <w:t>/</w:t>
       </w:r>
       <w:proofErr w:type="spellStart"/>
-      <w:proofErr w:type="gramStart"/>
       <w:r>
         <w:t>mydevopsapp:latest</w:t>
       </w:r>
       <w:proofErr w:type="spellEnd"/>
-      <w:proofErr w:type="gramEnd"/>
     </w:p>
     <w:p>
       <w:r>
@@ -762,45 +731,588 @@
     </w:p>
     <w:p>
       <w:r>
+        <w:t xml:space="preserve">from flask import Flask, </w:t>
+      </w:r>
+      <w:proofErr w:type="spellStart"/>
+      <w:r>
+        <w:t>render_template</w:t>
+      </w:r>
+      <w:proofErr w:type="spellEnd"/>
+      <w:r>
+        <w:t xml:space="preserve">, request, </w:t>
+      </w:r>
+      <w:proofErr w:type="spellStart"/>
+      <w:r>
+        <w:t>jsonify</w:t>
+      </w:r>
+      <w:proofErr w:type="spellEnd"/>
+    </w:p>
+    <w:p>
+      <w:r>
+        <w:t>import sqlite3</w:t>
+      </w:r>
+    </w:p>
+    <w:p/>
+    <w:p>
+      <w:r>
+        <w:t>app = Flask(__name__)</w:t>
+      </w:r>
+    </w:p>
+    <w:p/>
+    <w:p>
+      <w:r>
+        <w:t xml:space="preserve"># Database initialize </w:t>
+      </w:r>
+      <w:proofErr w:type="spellStart"/>
+      <w:r>
+        <w:t>karna</w:t>
+      </w:r>
+      <w:proofErr w:type="spellEnd"/>
+    </w:p>
+    <w:p>
+      <w:r>
+        <w:t xml:space="preserve">def </w:t>
+      </w:r>
+      <w:proofErr w:type="spellStart"/>
+      <w:r>
+        <w:t>init_db</w:t>
+      </w:r>
+      <w:proofErr w:type="spellEnd"/>
+      <w:r>
+        <w:t>():</w:t>
+      </w:r>
+    </w:p>
+    <w:p>
+      <w:r>
+        <w:t>    conn = sqlite3.connect('</w:t>
+      </w:r>
+      <w:proofErr w:type="spellStart"/>
+      <w:r>
+        <w:t>database.db</w:t>
+      </w:r>
+      <w:proofErr w:type="spellEnd"/>
+      <w:r>
+        <w:t>')</w:t>
+      </w:r>
+    </w:p>
+    <w:p>
+      <w:r>
+        <w:t xml:space="preserve">    </w:t>
+      </w:r>
+      <w:proofErr w:type="spellStart"/>
+      <w:r>
+        <w:t>conn.execute</w:t>
+      </w:r>
+      <w:proofErr w:type="spellEnd"/>
+      <w:r>
+        <w:t>('CREATE TABLE IF NOT EXISTS tasks (id INTEGER PRIMARY KEY, name TEXT, status TEXT)')</w:t>
+      </w:r>
+    </w:p>
+    <w:p>
+      <w:r>
+        <w:t xml:space="preserve">    </w:t>
+      </w:r>
+      <w:proofErr w:type="spellStart"/>
+      <w:r>
+        <w:t>conn.close</w:t>
+      </w:r>
+      <w:proofErr w:type="spellEnd"/>
+      <w:r>
+        <w:t>()</w:t>
+      </w:r>
+    </w:p>
+    <w:p/>
+    <w:p>
+      <w:proofErr w:type="spellStart"/>
+      <w:r>
+        <w:t>init_db</w:t>
+      </w:r>
+      <w:proofErr w:type="spellEnd"/>
+      <w:r>
+        <w:t>()</w:t>
+      </w:r>
+    </w:p>
+    <w:p/>
+    <w:p>
+      <w:r>
+        <w:t xml:space="preserve"># Home page - HTML serve </w:t>
+      </w:r>
+      <w:proofErr w:type="spellStart"/>
+      <w:r>
+        <w:t>karega</w:t>
+      </w:r>
+      <w:proofErr w:type="spellEnd"/>
+    </w:p>
+    <w:p>
+      <w:r>
+        <w:t>@app.route('/')</w:t>
+      </w:r>
+    </w:p>
+    <w:p>
+      <w:r>
+        <w:t>def index():</w:t>
+      </w:r>
+    </w:p>
+    <w:p>
+      <w:r>
+        <w:t xml:space="preserve">    return </w:t>
+      </w:r>
+      <w:proofErr w:type="spellStart"/>
+      <w:r>
+        <w:t>render_template</w:t>
+      </w:r>
+      <w:proofErr w:type="spellEnd"/>
+      <w:r>
+        <w:t>('index.html')</w:t>
+      </w:r>
+    </w:p>
+    <w:p/>
+    <w:p>
+      <w:r>
+        <w:t xml:space="preserve"># API: Saari tasks get </w:t>
+      </w:r>
+      <w:proofErr w:type="spellStart"/>
+      <w:r>
+        <w:t>karna</w:t>
+      </w:r>
+      <w:proofErr w:type="spellEnd"/>
+    </w:p>
+    <w:p>
+      <w:r>
+        <w:t>@app.route('/api/tasks', methods=['GET'])</w:t>
+      </w:r>
+    </w:p>
+    <w:p>
+      <w:r>
+        <w:t xml:space="preserve">def </w:t>
+      </w:r>
+      <w:proofErr w:type="spellStart"/>
+      <w:r>
+        <w:t>get_tasks</w:t>
+      </w:r>
+      <w:proofErr w:type="spellEnd"/>
+      <w:r>
+        <w:t>():</w:t>
+      </w:r>
+    </w:p>
+    <w:p>
+      <w:r>
+        <w:t>    conn = sqlite3.connect('</w:t>
+      </w:r>
+      <w:proofErr w:type="spellStart"/>
+      <w:r>
+        <w:t>database.db</w:t>
+      </w:r>
+      <w:proofErr w:type="spellEnd"/>
+      <w:r>
+        <w:t>')</w:t>
+      </w:r>
+    </w:p>
+    <w:p>
+      <w:r>
+        <w:t xml:space="preserve">    cursor = </w:t>
+      </w:r>
+      <w:proofErr w:type="spellStart"/>
+      <w:r>
+        <w:t>conn.execute</w:t>
+      </w:r>
+      <w:proofErr w:type="spellEnd"/>
+      <w:r>
+        <w:t>('SELECT id, name, status FROM tasks')</w:t>
+      </w:r>
+    </w:p>
+    <w:p>
+      <w:r>
+        <w:t>    tasks = [{'id': row[0], 'name': row[1], 'status': row[2]} for row in cursor]</w:t>
+      </w:r>
+    </w:p>
+    <w:p>
+      <w:r>
+        <w:t xml:space="preserve">    </w:t>
+      </w:r>
+      <w:proofErr w:type="spellStart"/>
+      <w:r>
+        <w:t>conn.close</w:t>
+      </w:r>
+      <w:proofErr w:type="spellEnd"/>
+      <w:r>
+        <w:t>()</w:t>
+      </w:r>
+    </w:p>
+    <w:p>
+      <w:r>
+        <w:t xml:space="preserve">    return </w:t>
+      </w:r>
+      <w:proofErr w:type="spellStart"/>
+      <w:r>
+        <w:t>jsonify</w:t>
+      </w:r>
+      <w:proofErr w:type="spellEnd"/>
+      <w:r>
+        <w:t>(tasks)</w:t>
+      </w:r>
+    </w:p>
+    <w:p/>
+    <w:p>
+      <w:r>
         <w:lastRenderedPageBreak/>
-        <w:drawing>
-          <wp:inline distT="0" distB="0" distL="0" distR="0" wp14:anchorId="42BE93DD" wp14:editId="623DC79E">
-            <wp:extent cx="5943600" cy="3490595"/>
-            <wp:effectExtent l="0" t="0" r="0" b="0"/>
-            <wp:docPr id="477356188" name="Picture 1"/>
-            <wp:cNvGraphicFramePr>
-              <a:graphicFrameLocks xmlns:a="http://schemas.openxmlformats.org/drawingml/2006/main" noChangeAspect="1"/>
-            </wp:cNvGraphicFramePr>
-            <a:graphic xmlns:a="http://schemas.openxmlformats.org/drawingml/2006/main">
-              <a:graphicData uri="http://schemas.openxmlformats.org/drawingml/2006/picture">
-                <pic:pic xmlns:pic="http://schemas.openxmlformats.org/drawingml/2006/picture">
-                  <pic:nvPicPr>
-                    <pic:cNvPr id="477356188" name=""/>
-                    <pic:cNvPicPr/>
-                  </pic:nvPicPr>
-                  <pic:blipFill>
-                    <a:blip r:embed="rId14"/>
-                    <a:stretch>
-                      <a:fillRect/>
-                    </a:stretch>
-                  </pic:blipFill>
-                  <pic:spPr>
-                    <a:xfrm>
-                      <a:off x="0" y="0"/>
-                      <a:ext cx="5943600" cy="3490595"/>
-                    </a:xfrm>
-                    <a:prstGeom prst="rect">
-                      <a:avLst/>
-                    </a:prstGeom>
-                  </pic:spPr>
-                </pic:pic>
-              </a:graphicData>
-            </a:graphic>
-          </wp:inline>
-        </w:drawing>
+        <w:t xml:space="preserve"># API: Naya task add </w:t>
+      </w:r>
+      <w:proofErr w:type="spellStart"/>
+      <w:r>
+        <w:t>karna</w:t>
+      </w:r>
+      <w:proofErr w:type="spellEnd"/>
+    </w:p>
+    <w:p>
+      <w:r>
+        <w:t>@app.route('/api/tasks', methods=['POST'])</w:t>
+      </w:r>
+    </w:p>
+    <w:p>
+      <w:r>
+        <w:t xml:space="preserve">def </w:t>
+      </w:r>
+      <w:proofErr w:type="spellStart"/>
+      <w:r>
+        <w:t>add_task</w:t>
+      </w:r>
+      <w:proofErr w:type="spellEnd"/>
+      <w:r>
+        <w:t>():</w:t>
+      </w:r>
+    </w:p>
+    <w:p>
+      <w:r>
+        <w:t xml:space="preserve">    data = </w:t>
+      </w:r>
+      <w:proofErr w:type="spellStart"/>
+      <w:r>
+        <w:t>request.get_json</w:t>
+      </w:r>
+      <w:proofErr w:type="spellEnd"/>
+      <w:r>
+        <w:t>()</w:t>
+      </w:r>
+    </w:p>
+    <w:p>
+      <w:r>
+        <w:t xml:space="preserve">    name = </w:t>
+      </w:r>
+      <w:proofErr w:type="spellStart"/>
+      <w:r>
+        <w:t>data.get</w:t>
+      </w:r>
+      <w:proofErr w:type="spellEnd"/>
+      <w:r>
+        <w:t>('name')</w:t>
+      </w:r>
+    </w:p>
+    <w:p>
+      <w:r>
+        <w:t>    conn = sqlite3.connect('</w:t>
+      </w:r>
+      <w:proofErr w:type="spellStart"/>
+      <w:r>
+        <w:t>database.db</w:t>
+      </w:r>
+      <w:proofErr w:type="spellEnd"/>
+      <w:r>
+        <w:t>')</w:t>
+      </w:r>
+    </w:p>
+    <w:p>
+      <w:r>
+        <w:t xml:space="preserve">    </w:t>
+      </w:r>
+      <w:proofErr w:type="spellStart"/>
+      <w:r>
+        <w:t>conn.execute</w:t>
+      </w:r>
+      <w:proofErr w:type="spellEnd"/>
+      <w:r>
+        <w:t>('INSERT INTO tasks (name, status) VALUES (?, ?)', (name, 'pending'))</w:t>
+      </w:r>
+    </w:p>
+    <w:p>
+      <w:r>
+        <w:t xml:space="preserve">    </w:t>
+      </w:r>
+      <w:proofErr w:type="spellStart"/>
+      <w:r>
+        <w:t>conn.commit</w:t>
+      </w:r>
+      <w:proofErr w:type="spellEnd"/>
+      <w:r>
+        <w:t>()</w:t>
+      </w:r>
+    </w:p>
+    <w:p>
+      <w:r>
+        <w:t xml:space="preserve">    </w:t>
+      </w:r>
+      <w:proofErr w:type="spellStart"/>
+      <w:r>
+        <w:t>conn.close</w:t>
+      </w:r>
+      <w:proofErr w:type="spellEnd"/>
+      <w:r>
+        <w:t>()</w:t>
+      </w:r>
+    </w:p>
+    <w:p>
+      <w:r>
+        <w:t xml:space="preserve">    return </w:t>
+      </w:r>
+      <w:proofErr w:type="spellStart"/>
+      <w:r>
+        <w:t>jsonify</w:t>
+      </w:r>
+      <w:proofErr w:type="spellEnd"/>
+      <w:r>
+        <w:t>({'message': 'Task added'}), 201</w:t>
       </w:r>
     </w:p>
     <w:p/>
+    <w:p>
+      <w:r>
+        <w:t xml:space="preserve"># API: Task delete </w:t>
+      </w:r>
+      <w:proofErr w:type="spellStart"/>
+      <w:r>
+        <w:t>karna</w:t>
+      </w:r>
+      <w:proofErr w:type="spellEnd"/>
+    </w:p>
+    <w:p>
+      <w:r>
+        <w:t>@app.route('/api/tasks/&lt;int:task_id&gt;', methods=['DELETE'])</w:t>
+      </w:r>
+    </w:p>
+    <w:p>
+      <w:r>
+        <w:t xml:space="preserve">def </w:t>
+      </w:r>
+      <w:proofErr w:type="spellStart"/>
+      <w:r>
+        <w:t>delete_task</w:t>
+      </w:r>
+      <w:proofErr w:type="spellEnd"/>
+      <w:r>
+        <w:t>(</w:t>
+      </w:r>
+      <w:proofErr w:type="spellStart"/>
+      <w:r>
+        <w:t>task_id</w:t>
+      </w:r>
+      <w:proofErr w:type="spellEnd"/>
+      <w:r>
+        <w:t>):</w:t>
+      </w:r>
+    </w:p>
+    <w:p>
+      <w:r>
+        <w:t>    conn = sqlite3.connect('</w:t>
+      </w:r>
+      <w:proofErr w:type="spellStart"/>
+      <w:r>
+        <w:t>database.db</w:t>
+      </w:r>
+      <w:proofErr w:type="spellEnd"/>
+      <w:r>
+        <w:t>')</w:t>
+      </w:r>
+    </w:p>
+    <w:p>
+      <w:r>
+        <w:t xml:space="preserve">    </w:t>
+      </w:r>
+      <w:proofErr w:type="spellStart"/>
+      <w:r>
+        <w:t>conn.execute</w:t>
+      </w:r>
+      <w:proofErr w:type="spellEnd"/>
+      <w:r>
+        <w:t>('DELETE FROM tasks WHERE id = ?', (</w:t>
+      </w:r>
+      <w:proofErr w:type="spellStart"/>
+      <w:r>
+        <w:t>task_id</w:t>
+      </w:r>
+      <w:proofErr w:type="spellEnd"/>
+      <w:r>
+        <w:t>,))</w:t>
+      </w:r>
+    </w:p>
+    <w:p>
+      <w:r>
+        <w:t xml:space="preserve">    </w:t>
+      </w:r>
+      <w:proofErr w:type="spellStart"/>
+      <w:r>
+        <w:t>conn.commit</w:t>
+      </w:r>
+      <w:proofErr w:type="spellEnd"/>
+      <w:r>
+        <w:t>()</w:t>
+      </w:r>
+    </w:p>
+    <w:p>
+      <w:r>
+        <w:t xml:space="preserve">    </w:t>
+      </w:r>
+      <w:proofErr w:type="spellStart"/>
+      <w:r>
+        <w:t>conn.close</w:t>
+      </w:r>
+      <w:proofErr w:type="spellEnd"/>
+      <w:r>
+        <w:t>()</w:t>
+      </w:r>
+    </w:p>
+    <w:p>
+      <w:r>
+        <w:t xml:space="preserve">    return </w:t>
+      </w:r>
+      <w:proofErr w:type="spellStart"/>
+      <w:r>
+        <w:t>jsonify</w:t>
+      </w:r>
+      <w:proofErr w:type="spellEnd"/>
+      <w:r>
+        <w:t>({'message': 'Task deleted'})</w:t>
+      </w:r>
+    </w:p>
+    <w:p/>
+    <w:p>
+      <w:r>
+        <w:t xml:space="preserve"># API: Task complete </w:t>
+      </w:r>
+      <w:proofErr w:type="spellStart"/>
+      <w:r>
+        <w:t>karna</w:t>
+      </w:r>
+      <w:proofErr w:type="spellEnd"/>
+    </w:p>
+    <w:p>
+      <w:r>
+        <w:t>@app.route('/api/tasks/&lt;int:task_id&gt;/complete', methods=['PUT'])</w:t>
+      </w:r>
+    </w:p>
+    <w:p>
+      <w:r>
+        <w:t xml:space="preserve">def </w:t>
+      </w:r>
+      <w:proofErr w:type="spellStart"/>
+      <w:r>
+        <w:t>complete_task</w:t>
+      </w:r>
+      <w:proofErr w:type="spellEnd"/>
+      <w:r>
+        <w:t>(</w:t>
+      </w:r>
+      <w:proofErr w:type="spellStart"/>
+      <w:r>
+        <w:t>task_id</w:t>
+      </w:r>
+      <w:proofErr w:type="spellEnd"/>
+      <w:r>
+        <w:t>):</w:t>
+      </w:r>
+    </w:p>
+    <w:p>
+      <w:r>
+        <w:t>    conn = sqlite3.connect('</w:t>
+      </w:r>
+      <w:proofErr w:type="spellStart"/>
+      <w:r>
+        <w:t>database.db</w:t>
+      </w:r>
+      <w:proofErr w:type="spellEnd"/>
+      <w:r>
+        <w:t>')</w:t>
+      </w:r>
+    </w:p>
+    <w:p>
+      <w:r>
+        <w:t xml:space="preserve">    </w:t>
+      </w:r>
+      <w:proofErr w:type="spellStart"/>
+      <w:r>
+        <w:t>conn.execute</w:t>
+      </w:r>
+      <w:proofErr w:type="spellEnd"/>
+      <w:r>
+        <w:t xml:space="preserve">('UPDATE tasks SET status = ? WHERE id = ?', ('completed', </w:t>
+      </w:r>
+      <w:proofErr w:type="spellStart"/>
+      <w:r>
+        <w:t>task_id</w:t>
+      </w:r>
+      <w:proofErr w:type="spellEnd"/>
+      <w:r>
+        <w:t>))</w:t>
+      </w:r>
+    </w:p>
+    <w:p>
+      <w:r>
+        <w:t xml:space="preserve">    </w:t>
+      </w:r>
+      <w:proofErr w:type="spellStart"/>
+      <w:r>
+        <w:t>conn.commit</w:t>
+      </w:r>
+      <w:proofErr w:type="spellEnd"/>
+      <w:r>
+        <w:t>()</w:t>
+      </w:r>
+    </w:p>
+    <w:p>
+      <w:r>
+        <w:lastRenderedPageBreak/>
+        <w:t xml:space="preserve">    </w:t>
+      </w:r>
+      <w:proofErr w:type="spellStart"/>
+      <w:r>
+        <w:t>conn.close</w:t>
+      </w:r>
+      <w:proofErr w:type="spellEnd"/>
+      <w:r>
+        <w:t>()</w:t>
+      </w:r>
+    </w:p>
+    <w:p>
+      <w:r>
+        <w:t xml:space="preserve">    return </w:t>
+      </w:r>
+      <w:proofErr w:type="spellStart"/>
+      <w:r>
+        <w:t>jsonify</w:t>
+      </w:r>
+      <w:proofErr w:type="spellEnd"/>
+      <w:r>
+        <w:t>({'message': 'Task completed'})</w:t>
+      </w:r>
+    </w:p>
+    <w:p/>
+    <w:p>
+      <w:r>
+        <w:t>if __name__ == '__main__':</w:t>
+      </w:r>
+    </w:p>
+    <w:p>
+      <w:r>
+        <w:t xml:space="preserve">    </w:t>
+      </w:r>
+      <w:proofErr w:type="spellStart"/>
+      <w:r>
+        <w:t>app.run</w:t>
+      </w:r>
+      <w:proofErr w:type="spellEnd"/>
+      <w:r>
+        <w:t>(host='0.0.0.0', port=5000)</w:t>
+      </w:r>
+    </w:p>
     <w:p>
       <w:pPr>
         <w:rPr>
@@ -812,8 +1324,1149 @@
           <w:szCs w:val="32"/>
         </w:rPr>
       </w:pPr>
-      <w:proofErr w:type="spellStart"/>
-      <w:r>
+    </w:p>
+    <w:p>
+      <w:pPr>
+        <w:rPr>
+          <w:color w:val="E97132" w:themeColor="accent2"/>
+          <w:sz w:val="32"/>
+          <w:szCs w:val="32"/>
+        </w:rPr>
+      </w:pPr>
+      <w:r>
+        <w:rPr>
+          <w:color w:val="E97132" w:themeColor="accent2"/>
+          <w:sz w:val="32"/>
+          <w:szCs w:val="32"/>
+        </w:rPr>
+        <w:t xml:space="preserve"> Frontend Code (templates/index.html):</w:t>
+      </w:r>
+    </w:p>
+    <w:p>
+      <w:r>
+        <w:t>&lt;!DOCTYPE html&gt;</w:t>
+      </w:r>
+    </w:p>
+    <w:p>
+      <w:r>
+        <w:t>&lt;html lang="</w:t>
+      </w:r>
+      <w:proofErr w:type="spellStart"/>
+      <w:r>
+        <w:t>en</w:t>
+      </w:r>
+      <w:proofErr w:type="spellEnd"/>
+      <w:r>
+        <w:t>"&gt;</w:t>
+      </w:r>
+    </w:p>
+    <w:p>
+      <w:r>
+        <w:t>&lt;head&gt;</w:t>
+      </w:r>
+    </w:p>
+    <w:p>
+      <w:r>
+        <w:t>    &lt;meta charset="UTF-8"&gt;</w:t>
+      </w:r>
+    </w:p>
+    <w:p>
+      <w:r>
+        <w:t>    &lt;meta name="viewport" content="width=device-width, initial-scale=1.0"&gt;</w:t>
+      </w:r>
+    </w:p>
+    <w:p>
+      <w:r>
+        <w:t>    &lt;title&gt;DevOps Todo App&lt;/title&gt;</w:t>
+      </w:r>
+    </w:p>
+    <w:p>
+      <w:r>
+        <w:t>    &lt;style&gt;</w:t>
+      </w:r>
+    </w:p>
+    <w:p>
+      <w:r>
+        <w:t>        * { margin: 0; padding: 0; box-sizing: border-box; }</w:t>
+      </w:r>
+    </w:p>
+    <w:p>
+      <w:r>
+        <w:t>        body {</w:t>
+      </w:r>
+    </w:p>
+    <w:p>
+      <w:r>
+        <w:t>            font-family: Arial, sans-serif;</w:t>
+      </w:r>
+    </w:p>
+    <w:p>
+      <w:r>
+        <w:t>            background: linear-gradient(135deg, #667eea 0%, #764ba2 100%);</w:t>
+      </w:r>
+    </w:p>
+    <w:p>
+      <w:r>
+        <w:t>            min-height: 100vh;</w:t>
+      </w:r>
+    </w:p>
+    <w:p>
+      <w:r>
+        <w:t>            display: flex;</w:t>
+      </w:r>
+    </w:p>
+    <w:p>
+      <w:r>
+        <w:t>            justify-content: center;</w:t>
+      </w:r>
+    </w:p>
+    <w:p>
+      <w:r>
+        <w:t>            align-items: center;</w:t>
+      </w:r>
+    </w:p>
+    <w:p>
+      <w:r>
+        <w:t>            padding: 20px;</w:t>
+      </w:r>
+    </w:p>
+    <w:p>
+      <w:r>
+        <w:t>        }</w:t>
+      </w:r>
+    </w:p>
+    <w:p>
+      <w:r>
+        <w:t>        .container {</w:t>
+      </w:r>
+    </w:p>
+    <w:p>
+      <w:r>
+        <w:lastRenderedPageBreak/>
+        <w:t>            background: white;</w:t>
+      </w:r>
+    </w:p>
+    <w:p>
+      <w:r>
+        <w:t>            border-radius: 15px;</w:t>
+      </w:r>
+    </w:p>
+    <w:p>
+      <w:r>
+        <w:t>            padding: 30px;</w:t>
+      </w:r>
+    </w:p>
+    <w:p>
+      <w:r>
+        <w:t>            width: 100%;</w:t>
+      </w:r>
+    </w:p>
+    <w:p>
+      <w:r>
+        <w:t>            max-width: 500px;</w:t>
+      </w:r>
+    </w:p>
+    <w:p>
+      <w:r>
+        <w:t xml:space="preserve">            box-shadow: 0 10px 40px </w:t>
+      </w:r>
+      <w:proofErr w:type="spellStart"/>
+      <w:r>
+        <w:t>rgba</w:t>
+      </w:r>
+      <w:proofErr w:type="spellEnd"/>
+      <w:r>
+        <w:t>(0,0,0,0.2);</w:t>
+      </w:r>
+    </w:p>
+    <w:p>
+      <w:r>
+        <w:t>        }</w:t>
+      </w:r>
+    </w:p>
+    <w:p>
+      <w:r>
+        <w:t>        h1 {</w:t>
+      </w:r>
+    </w:p>
+    <w:p>
+      <w:r>
+        <w:t>            text-align: center;</w:t>
+      </w:r>
+    </w:p>
+    <w:p>
+      <w:r>
+        <w:t>            color: #333;</w:t>
+      </w:r>
+    </w:p>
+    <w:p>
+      <w:r>
+        <w:t>            margin-bottom: 20px;</w:t>
+      </w:r>
+    </w:p>
+    <w:p>
+      <w:r>
+        <w:t>        }</w:t>
+      </w:r>
+    </w:p>
+    <w:p>
+      <w:r>
+        <w:t>        .input-group {</w:t>
+      </w:r>
+    </w:p>
+    <w:p>
+      <w:r>
+        <w:t>            display: flex;</w:t>
+      </w:r>
+    </w:p>
+    <w:p>
+      <w:r>
+        <w:t>            gap: 10px;</w:t>
+      </w:r>
+    </w:p>
+    <w:p>
+      <w:r>
+        <w:t>            margin-bottom: 20px;</w:t>
+      </w:r>
+    </w:p>
+    <w:p>
+      <w:r>
+        <w:t>        }</w:t>
+      </w:r>
+    </w:p>
+    <w:p>
+      <w:r>
+        <w:t>        input {</w:t>
+      </w:r>
+    </w:p>
+    <w:p>
+      <w:r>
+        <w:t>            flex: 1;</w:t>
+      </w:r>
+    </w:p>
+    <w:p>
+      <w:r>
+        <w:t>            padding: 12px;</w:t>
+      </w:r>
+    </w:p>
+    <w:p>
+      <w:r>
+        <w:t>            border: 2px solid #ddd;</w:t>
+      </w:r>
+    </w:p>
+    <w:p>
+      <w:r>
+        <w:t>            border-radius: 8px;</w:t>
+      </w:r>
+    </w:p>
+    <w:p>
+      <w:r>
+        <w:t>            font-size: 16px;</w:t>
+      </w:r>
+    </w:p>
+    <w:p>
+      <w:r>
+        <w:t>        }</w:t>
+      </w:r>
+    </w:p>
+    <w:p>
+      <w:r>
+        <w:t>        button {</w:t>
+      </w:r>
+    </w:p>
+    <w:p>
+      <w:r>
+        <w:t>            padding: 12px 20px;</w:t>
+      </w:r>
+    </w:p>
+    <w:p>
+      <w:r>
+        <w:lastRenderedPageBreak/>
+        <w:t>            background: #667eea;</w:t>
+      </w:r>
+    </w:p>
+    <w:p>
+      <w:r>
+        <w:t>            color: white;</w:t>
+      </w:r>
+    </w:p>
+    <w:p>
+      <w:r>
+        <w:t>            border: none;</w:t>
+      </w:r>
+    </w:p>
+    <w:p>
+      <w:r>
+        <w:t>            border-radius: 8px;</w:t>
+      </w:r>
+    </w:p>
+    <w:p>
+      <w:r>
+        <w:t>            cursor: pointer;</w:t>
+      </w:r>
+    </w:p>
+    <w:p>
+      <w:r>
+        <w:t>            font-size: 16px;</w:t>
+      </w:r>
+    </w:p>
+    <w:p>
+      <w:r>
+        <w:t>        }</w:t>
+      </w:r>
+    </w:p>
+    <w:p>
+      <w:r>
+        <w:t xml:space="preserve">        </w:t>
+      </w:r>
+      <w:proofErr w:type="spellStart"/>
+      <w:r>
+        <w:t>button:hover</w:t>
+      </w:r>
+      <w:proofErr w:type="spellEnd"/>
+      <w:r>
+        <w:t xml:space="preserve"> { background: #5a67d8; }</w:t>
+      </w:r>
+    </w:p>
+    <w:p>
+      <w:r>
+        <w:t>        .task-item {</w:t>
+      </w:r>
+    </w:p>
+    <w:p>
+      <w:r>
+        <w:t>            display: flex;</w:t>
+      </w:r>
+    </w:p>
+    <w:p>
+      <w:r>
+        <w:t>            justify-content: space-between;</w:t>
+      </w:r>
+    </w:p>
+    <w:p>
+      <w:r>
+        <w:t>            align-items: center;</w:t>
+      </w:r>
+    </w:p>
+    <w:p>
+      <w:r>
+        <w:t>            padding: 12px;</w:t>
+      </w:r>
+    </w:p>
+    <w:p>
+      <w:r>
+        <w:t>            border-bottom: 1px solid #eee;</w:t>
+      </w:r>
+    </w:p>
+    <w:p>
+      <w:r>
+        <w:t>        }</w:t>
+      </w:r>
+    </w:p>
+    <w:p>
+      <w:r>
+        <w:t>        .task-name {</w:t>
+      </w:r>
+    </w:p>
+    <w:p>
+      <w:r>
+        <w:t>            font-size: 16px;</w:t>
+      </w:r>
+    </w:p>
+    <w:p>
+      <w:r>
+        <w:t>        }</w:t>
+      </w:r>
+    </w:p>
+    <w:p>
+      <w:r>
+        <w:t>        .task-</w:t>
+      </w:r>
+      <w:proofErr w:type="spellStart"/>
+      <w:r>
+        <w:t>name.completed</w:t>
+      </w:r>
+      <w:proofErr w:type="spellEnd"/>
+      <w:r>
+        <w:t xml:space="preserve"> {</w:t>
+      </w:r>
+    </w:p>
+    <w:p>
+      <w:r>
+        <w:t>            text-decoration: line-through;</w:t>
+      </w:r>
+    </w:p>
+    <w:p>
+      <w:r>
+        <w:t>            color: #888;</w:t>
+      </w:r>
+    </w:p>
+    <w:p>
+      <w:r>
+        <w:t>        }</w:t>
+      </w:r>
+    </w:p>
+    <w:p>
+      <w:r>
+        <w:t>        .task-actions button {</w:t>
+      </w:r>
+    </w:p>
+    <w:p>
+      <w:r>
+        <w:t>            padding: 5px 10px;</w:t>
+      </w:r>
+    </w:p>
+    <w:p>
+      <w:r>
+        <w:t>            margin-left: 5px;</w:t>
+      </w:r>
+    </w:p>
+    <w:p>
+      <w:r>
+        <w:t>            font-size: 12px;</w:t>
+      </w:r>
+    </w:p>
+    <w:p>
+      <w:r>
+        <w:lastRenderedPageBreak/>
+        <w:t>        }</w:t>
+      </w:r>
+    </w:p>
+    <w:p>
+      <w:r>
+        <w:t>        .complete-</w:t>
+      </w:r>
+      <w:proofErr w:type="spellStart"/>
+      <w:r>
+        <w:t>btn</w:t>
+      </w:r>
+      <w:proofErr w:type="spellEnd"/>
+      <w:r>
+        <w:t xml:space="preserve"> { background: #48bb78; }</w:t>
+      </w:r>
+    </w:p>
+    <w:p>
+      <w:r>
+        <w:t>        .delete-</w:t>
+      </w:r>
+      <w:proofErr w:type="spellStart"/>
+      <w:r>
+        <w:t>btn</w:t>
+      </w:r>
+      <w:proofErr w:type="spellEnd"/>
+      <w:r>
+        <w:t xml:space="preserve"> { background: #f56565; }</w:t>
+      </w:r>
+    </w:p>
+    <w:p>
+      <w:r>
+        <w:t>        .stats {</w:t>
+      </w:r>
+    </w:p>
+    <w:p>
+      <w:r>
+        <w:t>            margin-top: 20px;</w:t>
+      </w:r>
+    </w:p>
+    <w:p>
+      <w:r>
+        <w:t>            text-align: center;</w:t>
+      </w:r>
+    </w:p>
+    <w:p>
+      <w:r>
+        <w:t>            color: #666;</w:t>
+      </w:r>
+    </w:p>
+    <w:p>
+      <w:r>
+        <w:t>        }</w:t>
+      </w:r>
+    </w:p>
+    <w:p>
+      <w:r>
+        <w:t>    &lt;/style&gt;</w:t>
+      </w:r>
+    </w:p>
+    <w:p>
+      <w:r>
+        <w:t>&lt;/head&gt;</w:t>
+      </w:r>
+    </w:p>
+    <w:p>
+      <w:r>
+        <w:t>&lt;body&gt;</w:t>
+      </w:r>
+    </w:p>
+    <w:p>
+      <w:r>
+        <w:t>    &lt;div class="container"&gt;</w:t>
+      </w:r>
+    </w:p>
+    <w:p>
+      <w:r>
+        <w:t>        &lt;h1&gt;</w:t>
+      </w:r>
+      <w:r>
+        <w:rPr>
+          <w:rFonts w:ascii="Segoe UI Emoji" w:hAnsi="Segoe UI Emoji" w:cs="Segoe UI Emoji"/>
+        </w:rPr>
+        <w:t>📋</w:t>
+      </w:r>
+      <w:r>
+        <w:t xml:space="preserve"> DevOps Todo App&lt;/h1&gt;</w:t>
+      </w:r>
+    </w:p>
+    <w:p>
+      <w:r>
+        <w:t>        &lt;div class="input-group"&gt;</w:t>
+      </w:r>
+    </w:p>
+    <w:p>
+      <w:r>
+        <w:t>            &lt;input type="text" id="</w:t>
+      </w:r>
+      <w:proofErr w:type="spellStart"/>
+      <w:r>
+        <w:t>taskInput</w:t>
+      </w:r>
+      <w:proofErr w:type="spellEnd"/>
+      <w:r>
+        <w:t>" placeholder="Enter a new task..."&gt;</w:t>
+      </w:r>
+    </w:p>
+    <w:p>
+      <w:r>
+        <w:t>            &lt;button onclick="</w:t>
+      </w:r>
+      <w:proofErr w:type="spellStart"/>
+      <w:r>
+        <w:t>addTask</w:t>
+      </w:r>
+      <w:proofErr w:type="spellEnd"/>
+      <w:r>
+        <w:t>()"&gt;Add Task&lt;/button&gt;</w:t>
+      </w:r>
+    </w:p>
+    <w:p>
+      <w:r>
+        <w:t>        &lt;/div&gt;</w:t>
+      </w:r>
+    </w:p>
+    <w:p>
+      <w:r>
+        <w:t>        &lt;div id="</w:t>
+      </w:r>
+      <w:proofErr w:type="spellStart"/>
+      <w:r>
+        <w:t>taskList</w:t>
+      </w:r>
+      <w:proofErr w:type="spellEnd"/>
+      <w:r>
+        <w:t>"&gt;&lt;/div&gt;</w:t>
+      </w:r>
+    </w:p>
+    <w:p>
+      <w:r>
+        <w:t>        &lt;div class="stats" id="stats"&gt;&lt;/div&gt;</w:t>
+      </w:r>
+    </w:p>
+    <w:p>
+      <w:r>
+        <w:t>    &lt;/div&gt;</w:t>
+      </w:r>
+    </w:p>
+    <w:p/>
+    <w:p>
+      <w:r>
+        <w:t>    &lt;script&gt;</w:t>
+      </w:r>
+    </w:p>
+    <w:p>
+      <w:r>
+        <w:t xml:space="preserve">        async function </w:t>
+      </w:r>
+      <w:proofErr w:type="spellStart"/>
+      <w:r>
+        <w:t>loadTasks</w:t>
+      </w:r>
+      <w:proofErr w:type="spellEnd"/>
+      <w:r>
+        <w:t>() {</w:t>
+      </w:r>
+    </w:p>
+    <w:p>
+      <w:r>
+        <w:t>            const response = await fetch('/</w:t>
+      </w:r>
+      <w:proofErr w:type="spellStart"/>
+      <w:r>
+        <w:t>api</w:t>
+      </w:r>
+      <w:proofErr w:type="spellEnd"/>
+      <w:r>
+        <w:t>/tasks');</w:t>
+      </w:r>
+    </w:p>
+    <w:p>
+      <w:r>
+        <w:t xml:space="preserve">            const tasks = await </w:t>
+      </w:r>
+      <w:proofErr w:type="spellStart"/>
+      <w:r>
+        <w:t>response.json</w:t>
+      </w:r>
+      <w:proofErr w:type="spellEnd"/>
+      <w:r>
+        <w:t>();</w:t>
+      </w:r>
+    </w:p>
+    <w:p>
+      <w:r>
+        <w:t xml:space="preserve">            const </w:t>
+      </w:r>
+      <w:proofErr w:type="spellStart"/>
+      <w:r>
+        <w:t>taskList</w:t>
+      </w:r>
+      <w:proofErr w:type="spellEnd"/>
+      <w:r>
+        <w:t xml:space="preserve"> = </w:t>
+      </w:r>
+      <w:proofErr w:type="spellStart"/>
+      <w:r>
+        <w:t>document.getElementById</w:t>
+      </w:r>
+      <w:proofErr w:type="spellEnd"/>
+      <w:r>
+        <w:t>('</w:t>
+      </w:r>
+      <w:proofErr w:type="spellStart"/>
+      <w:r>
+        <w:t>taskList</w:t>
+      </w:r>
+      <w:proofErr w:type="spellEnd"/>
+      <w:r>
+        <w:t>');</w:t>
+      </w:r>
+    </w:p>
+    <w:p>
+      <w:r>
+        <w:lastRenderedPageBreak/>
+        <w:t xml:space="preserve">            const stats = </w:t>
+      </w:r>
+      <w:proofErr w:type="spellStart"/>
+      <w:r>
+        <w:t>document.getElementById</w:t>
+      </w:r>
+      <w:proofErr w:type="spellEnd"/>
+      <w:r>
+        <w:t>('stats');</w:t>
+      </w:r>
+    </w:p>
+    <w:p>
+      <w:r>
+        <w:t xml:space="preserve">            </w:t>
+      </w:r>
+    </w:p>
+    <w:p>
+      <w:r>
+        <w:t xml:space="preserve">            const </w:t>
+      </w:r>
+      <w:proofErr w:type="spellStart"/>
+      <w:r>
+        <w:t>pendingTasks</w:t>
+      </w:r>
+      <w:proofErr w:type="spellEnd"/>
+      <w:r>
+        <w:t xml:space="preserve"> = </w:t>
+      </w:r>
+      <w:proofErr w:type="spellStart"/>
+      <w:r>
+        <w:t>tasks.filter</w:t>
+      </w:r>
+      <w:proofErr w:type="spellEnd"/>
+      <w:r>
+        <w:t xml:space="preserve">(t =&gt; </w:t>
+      </w:r>
+      <w:proofErr w:type="spellStart"/>
+      <w:r>
+        <w:t>t.status</w:t>
+      </w:r>
+      <w:proofErr w:type="spellEnd"/>
+      <w:r>
+        <w:t xml:space="preserve"> === 'pending').length;</w:t>
+      </w:r>
+    </w:p>
+    <w:p>
+      <w:r>
+        <w:t xml:space="preserve">            const </w:t>
+      </w:r>
+      <w:proofErr w:type="spellStart"/>
+      <w:r>
+        <w:t>completedTasks</w:t>
+      </w:r>
+      <w:proofErr w:type="spellEnd"/>
+      <w:r>
+        <w:t xml:space="preserve"> = </w:t>
+      </w:r>
+      <w:proofErr w:type="spellStart"/>
+      <w:r>
+        <w:t>tasks.filter</w:t>
+      </w:r>
+      <w:proofErr w:type="spellEnd"/>
+      <w:r>
+        <w:t xml:space="preserve">(t =&gt; </w:t>
+      </w:r>
+      <w:proofErr w:type="spellStart"/>
+      <w:r>
+        <w:t>t.status</w:t>
+      </w:r>
+      <w:proofErr w:type="spellEnd"/>
+      <w:r>
+        <w:t xml:space="preserve"> === 'completed').length;</w:t>
+      </w:r>
+    </w:p>
+    <w:p>
+      <w:r>
+        <w:t xml:space="preserve">            </w:t>
+      </w:r>
+    </w:p>
+    <w:p>
+      <w:r>
+        <w:t xml:space="preserve">            </w:t>
+      </w:r>
+      <w:proofErr w:type="spellStart"/>
+      <w:r>
+        <w:t>stats.innerHTML</w:t>
+      </w:r>
+      <w:proofErr w:type="spellEnd"/>
+      <w:r>
+        <w:t xml:space="preserve"> = `</w:t>
+      </w:r>
+      <w:r>
+        <w:rPr>
+          <w:rFonts w:ascii="Segoe UI Emoji" w:hAnsi="Segoe UI Emoji" w:cs="Segoe UI Emoji"/>
+        </w:rPr>
+        <w:t>📊</w:t>
+      </w:r>
+      <w:r>
+        <w:t xml:space="preserve"> Pending: ${</w:t>
+      </w:r>
+      <w:proofErr w:type="spellStart"/>
+      <w:r>
+        <w:t>pendingTasks</w:t>
+      </w:r>
+      <w:proofErr w:type="spellEnd"/>
+      <w:r>
+        <w:t xml:space="preserve">} | </w:t>
+      </w:r>
+      <w:r>
+        <w:rPr>
+          <w:rFonts w:ascii="Segoe UI Emoji" w:hAnsi="Segoe UI Emoji" w:cs="Segoe UI Emoji"/>
+        </w:rPr>
+        <w:t>✅</w:t>
+      </w:r>
+      <w:r>
+        <w:t xml:space="preserve"> Completed: ${</w:t>
+      </w:r>
+      <w:proofErr w:type="spellStart"/>
+      <w:r>
+        <w:t>completedTasks</w:t>
+      </w:r>
+      <w:proofErr w:type="spellEnd"/>
+      <w:r>
+        <w:t>}`;</w:t>
+      </w:r>
+    </w:p>
+    <w:p>
+      <w:r>
+        <w:t xml:space="preserve">            </w:t>
+      </w:r>
+    </w:p>
+    <w:p>
+      <w:r>
+        <w:t xml:space="preserve">            </w:t>
+      </w:r>
+      <w:proofErr w:type="spellStart"/>
+      <w:r>
+        <w:t>taskList.innerHTML</w:t>
+      </w:r>
+      <w:proofErr w:type="spellEnd"/>
+      <w:r>
+        <w:t xml:space="preserve"> = </w:t>
+      </w:r>
+      <w:proofErr w:type="spellStart"/>
+      <w:r>
+        <w:t>tasks.map</w:t>
+      </w:r>
+      <w:proofErr w:type="spellEnd"/>
+      <w:r>
+        <w:t>(task =&gt; `</w:t>
+      </w:r>
+    </w:p>
+    <w:p>
+      <w:r>
+        <w:t>                &lt;div class="task-item"&gt;</w:t>
+      </w:r>
+    </w:p>
+    <w:p>
+      <w:r>
+        <w:t>                    &lt;span class="task-name ${</w:t>
+      </w:r>
+      <w:proofErr w:type="spellStart"/>
+      <w:r>
+        <w:t>task.status</w:t>
+      </w:r>
+      <w:proofErr w:type="spellEnd"/>
+      <w:r>
+        <w:t xml:space="preserve"> === 'completed' ? 'completed' : ''}"&gt;${task.name}&lt;/span&gt;</w:t>
+      </w:r>
+    </w:p>
+    <w:p>
+      <w:r>
+        <w:t>                    &lt;div class="task-actions"&gt;</w:t>
+      </w:r>
+    </w:p>
+    <w:p>
+      <w:r>
+        <w:t>                        ${</w:t>
+      </w:r>
+      <w:proofErr w:type="spellStart"/>
+      <w:r>
+        <w:t>task.status</w:t>
+      </w:r>
+      <w:proofErr w:type="spellEnd"/>
+      <w:r>
+        <w:t xml:space="preserve"> === 'pending' ? `&lt;button class="complete-</w:t>
+      </w:r>
+      <w:proofErr w:type="spellStart"/>
+      <w:r>
+        <w:t>btn</w:t>
+      </w:r>
+      <w:proofErr w:type="spellEnd"/>
+      <w:r>
+        <w:t>" onclick="</w:t>
+      </w:r>
+      <w:proofErr w:type="spellStart"/>
+      <w:r>
+        <w:t>completeTask</w:t>
+      </w:r>
+      <w:proofErr w:type="spellEnd"/>
+      <w:r>
+        <w:t>(${task.id})"&gt;✓&lt;/button&gt;` : ''}</w:t>
+      </w:r>
+    </w:p>
+    <w:p>
+      <w:r>
+        <w:t>                        &lt;button class="delete-</w:t>
+      </w:r>
+      <w:proofErr w:type="spellStart"/>
+      <w:r>
+        <w:t>btn</w:t>
+      </w:r>
+      <w:proofErr w:type="spellEnd"/>
+      <w:r>
+        <w:t>" onclick="</w:t>
+      </w:r>
+      <w:proofErr w:type="spellStart"/>
+      <w:r>
+        <w:t>deleteTask</w:t>
+      </w:r>
+      <w:proofErr w:type="spellEnd"/>
+      <w:r>
+        <w:t>(${task.id})"&gt;</w:t>
+      </w:r>
+      <w:r>
+        <w:rPr>
+          <w:rFonts w:ascii="Segoe UI Symbol" w:hAnsi="Segoe UI Symbol" w:cs="Segoe UI Symbol"/>
+        </w:rPr>
+        <w:t>🗑</w:t>
+      </w:r>
+      <w:r>
+        <w:t>&lt;/button&gt;</w:t>
+      </w:r>
+    </w:p>
+    <w:p>
+      <w:r>
+        <w:t>                    &lt;/div&gt;</w:t>
+      </w:r>
+    </w:p>
+    <w:p>
+      <w:r>
+        <w:t>                &lt;/div&gt;</w:t>
+      </w:r>
+    </w:p>
+    <w:p>
+      <w:r>
+        <w:t>            `).join('');</w:t>
+      </w:r>
+    </w:p>
+    <w:p>
+      <w:r>
+        <w:t>        }</w:t>
+      </w:r>
+    </w:p>
+    <w:p/>
+    <w:p>
+      <w:r>
+        <w:t xml:space="preserve">        async function </w:t>
+      </w:r>
+      <w:proofErr w:type="spellStart"/>
+      <w:r>
+        <w:t>addTask</w:t>
+      </w:r>
+      <w:proofErr w:type="spellEnd"/>
+      <w:r>
+        <w:t>() {</w:t>
+      </w:r>
+    </w:p>
+    <w:p>
+      <w:r>
+        <w:t xml:space="preserve">            const input = </w:t>
+      </w:r>
+      <w:proofErr w:type="spellStart"/>
+      <w:r>
+        <w:t>document.getElementById</w:t>
+      </w:r>
+      <w:proofErr w:type="spellEnd"/>
+      <w:r>
+        <w:t>('</w:t>
+      </w:r>
+      <w:proofErr w:type="spellStart"/>
+      <w:r>
+        <w:t>taskInput</w:t>
+      </w:r>
+      <w:proofErr w:type="spellEnd"/>
+      <w:r>
+        <w:t>');</w:t>
+      </w:r>
+    </w:p>
+    <w:p>
+      <w:r>
+        <w:t xml:space="preserve">            const name = </w:t>
+      </w:r>
+      <w:proofErr w:type="spellStart"/>
+      <w:r>
+        <w:t>input.value.trim</w:t>
+      </w:r>
+      <w:proofErr w:type="spellEnd"/>
+      <w:r>
+        <w:t>();</w:t>
+      </w:r>
+    </w:p>
+    <w:p>
+      <w:r>
+        <w:t>            if (!name) return;</w:t>
+      </w:r>
+    </w:p>
+    <w:p>
+      <w:r>
+        <w:t xml:space="preserve">            </w:t>
+      </w:r>
+    </w:p>
+    <w:p>
+      <w:r>
+        <w:t>            await fetch('/</w:t>
+      </w:r>
+      <w:proofErr w:type="spellStart"/>
+      <w:r>
+        <w:t>api</w:t>
+      </w:r>
+      <w:proofErr w:type="spellEnd"/>
+      <w:r>
+        <w:t>/tasks', {</w:t>
+      </w:r>
+    </w:p>
+    <w:p>
+      <w:r>
+        <w:lastRenderedPageBreak/>
+        <w:t>                method: 'POST',</w:t>
+      </w:r>
+    </w:p>
+    <w:p>
+      <w:r>
+        <w:t>                headers: {'Content-Type': 'application/</w:t>
+      </w:r>
+      <w:proofErr w:type="spellStart"/>
+      <w:r>
+        <w:t>json</w:t>
+      </w:r>
+      <w:proofErr w:type="spellEnd"/>
+      <w:r>
+        <w:t>'},</w:t>
+      </w:r>
+    </w:p>
+    <w:p>
+      <w:r>
+        <w:t xml:space="preserve">                body: </w:t>
+      </w:r>
+      <w:proofErr w:type="spellStart"/>
+      <w:r>
+        <w:t>JSON.stringify</w:t>
+      </w:r>
+      <w:proofErr w:type="spellEnd"/>
+      <w:r>
+        <w:t>({name})</w:t>
+      </w:r>
+    </w:p>
+    <w:p>
+      <w:r>
+        <w:t>            });</w:t>
+      </w:r>
+    </w:p>
+    <w:p>
+      <w:r>
+        <w:t xml:space="preserve">            </w:t>
+      </w:r>
+      <w:proofErr w:type="spellStart"/>
+      <w:r>
+        <w:t>input.value</w:t>
+      </w:r>
+      <w:proofErr w:type="spellEnd"/>
+      <w:r>
+        <w:t xml:space="preserve"> = '';</w:t>
+      </w:r>
+    </w:p>
+    <w:p>
+      <w:r>
+        <w:t xml:space="preserve">            </w:t>
+      </w:r>
+      <w:proofErr w:type="spellStart"/>
+      <w:r>
+        <w:t>loadTasks</w:t>
+      </w:r>
+      <w:proofErr w:type="spellEnd"/>
+      <w:r>
+        <w:t>();</w:t>
+      </w:r>
+    </w:p>
+    <w:p>
+      <w:r>
+        <w:t>        }</w:t>
+      </w:r>
+    </w:p>
+    <w:p/>
+    <w:p>
+      <w:r>
+        <w:t xml:space="preserve">        async function </w:t>
+      </w:r>
+      <w:proofErr w:type="spellStart"/>
+      <w:r>
+        <w:t>completeTask</w:t>
+      </w:r>
+      <w:proofErr w:type="spellEnd"/>
+      <w:r>
+        <w:t>(id) {</w:t>
+      </w:r>
+    </w:p>
+    <w:p>
+      <w:r>
+        <w:t>            await fetch(`/</w:t>
+      </w:r>
+      <w:proofErr w:type="spellStart"/>
+      <w:r>
+        <w:t>api</w:t>
+      </w:r>
+      <w:proofErr w:type="spellEnd"/>
+      <w:r>
+        <w:t>/tasks/${id}/complete`, {method: 'PUT'});</w:t>
+      </w:r>
+    </w:p>
+    <w:p>
+      <w:r>
+        <w:t xml:space="preserve">            </w:t>
+      </w:r>
+      <w:proofErr w:type="spellStart"/>
+      <w:r>
+        <w:t>loadTasks</w:t>
+      </w:r>
+      <w:proofErr w:type="spellEnd"/>
+      <w:r>
+        <w:t>();</w:t>
+      </w:r>
+    </w:p>
+    <w:p>
+      <w:r>
+        <w:t>        }</w:t>
+      </w:r>
+    </w:p>
+    <w:p/>
+    <w:p>
+      <w:r>
+        <w:t xml:space="preserve">        async function </w:t>
+      </w:r>
+      <w:proofErr w:type="spellStart"/>
+      <w:r>
+        <w:t>deleteTask</w:t>
+      </w:r>
+      <w:proofErr w:type="spellEnd"/>
+      <w:r>
+        <w:t>(id) {</w:t>
+      </w:r>
+    </w:p>
+    <w:p>
+      <w:r>
+        <w:t>            await fetch(`/</w:t>
+      </w:r>
+      <w:proofErr w:type="spellStart"/>
+      <w:r>
+        <w:t>api</w:t>
+      </w:r>
+      <w:proofErr w:type="spellEnd"/>
+      <w:r>
+        <w:t>/tasks/${id}`, {method: 'DELETE'});</w:t>
+      </w:r>
+    </w:p>
+    <w:p>
+      <w:r>
+        <w:t xml:space="preserve">            </w:t>
+      </w:r>
+      <w:proofErr w:type="spellStart"/>
+      <w:r>
+        <w:t>loadTasks</w:t>
+      </w:r>
+      <w:proofErr w:type="spellEnd"/>
+      <w:r>
+        <w:t>();</w:t>
+      </w:r>
+    </w:p>
+    <w:p>
+      <w:r>
+        <w:t>        }</w:t>
+      </w:r>
+    </w:p>
+    <w:p/>
+    <w:p>
+      <w:r>
+        <w:t xml:space="preserve">        </w:t>
+      </w:r>
+      <w:proofErr w:type="spellStart"/>
+      <w:r>
+        <w:t>loadTasks</w:t>
+      </w:r>
+      <w:proofErr w:type="spellEnd"/>
+      <w:r>
+        <w:t>();</w:t>
+      </w:r>
+    </w:p>
+    <w:p>
+      <w:r>
+        <w:t>    &lt;/script&gt;</w:t>
+      </w:r>
+    </w:p>
+    <w:p>
+      <w:r>
+        <w:t>&lt;/body&gt;</w:t>
+      </w:r>
+    </w:p>
+    <w:p>
+      <w:r>
+        <w:t>&lt;/html&gt;</w:t>
+      </w:r>
+    </w:p>
+    <w:p>
+      <w:pPr>
         <w:rPr>
           <w:rFonts w:ascii="Times New Roman" w:hAnsi="Times New Roman" w:cs="Times New Roman"/>
           <w:b/>
@@ -822,10 +2475,10 @@
           <w:sz w:val="32"/>
           <w:szCs w:val="32"/>
         </w:rPr>
-        <w:t>Dockerfile</w:t>
-      </w:r>
-      <w:proofErr w:type="spellEnd"/>
-      <w:r>
+      </w:pPr>
+    </w:p>
+    <w:p>
+      <w:pPr>
         <w:rPr>
           <w:rFonts w:ascii="Times New Roman" w:hAnsi="Times New Roman" w:cs="Times New Roman"/>
           <w:b/>
@@ -834,11 +2487,51 @@
           <w:sz w:val="32"/>
           <w:szCs w:val="32"/>
         </w:rPr>
+      </w:pPr>
+    </w:p>
+    <w:p/>
+    <w:p>
+      <w:pPr>
+        <w:rPr>
+          <w:rFonts w:ascii="Times New Roman" w:hAnsi="Times New Roman" w:cs="Times New Roman"/>
+          <w:b/>
+          <w:bCs/>
+          <w:color w:val="E97132" w:themeColor="accent2"/>
+          <w:sz w:val="32"/>
+          <w:szCs w:val="32"/>
+        </w:rPr>
+      </w:pPr>
+      <w:proofErr w:type="spellStart"/>
+      <w:r>
+        <w:rPr>
+          <w:rFonts w:ascii="Times New Roman" w:hAnsi="Times New Roman" w:cs="Times New Roman"/>
+          <w:b/>
+          <w:bCs/>
+          <w:color w:val="E97132" w:themeColor="accent2"/>
+          <w:sz w:val="32"/>
+          <w:szCs w:val="32"/>
+        </w:rPr>
+        <w:lastRenderedPageBreak/>
+        <w:t>Dockerfile</w:t>
+      </w:r>
+      <w:proofErr w:type="spellEnd"/>
+      <w:r>
+        <w:rPr>
+          <w:rFonts w:ascii="Times New Roman" w:hAnsi="Times New Roman" w:cs="Times New Roman"/>
+          <w:b/>
+          <w:bCs/>
+          <w:color w:val="E97132" w:themeColor="accent2"/>
+          <w:sz w:val="32"/>
+          <w:szCs w:val="32"/>
+        </w:rPr>
         <w:t xml:space="preserve"> Code:</w:t>
       </w:r>
     </w:p>
     <w:p>
       <w:r>
+        <w:rPr>
+          <w:noProof/>
+        </w:rPr>
         <w:drawing>
           <wp:inline distT="0" distB="0" distL="0" distR="0" wp14:anchorId="1CE5B3B6" wp14:editId="3D93829B">
             <wp:extent cx="5943600" cy="2627630"/>
@@ -855,7 +2548,7 @@
                     <pic:cNvPicPr/>
                   </pic:nvPicPr>
                   <pic:blipFill>
-                    <a:blip r:embed="rId15"/>
+                    <a:blip r:embed="rId14"/>
                     <a:stretch>
                       <a:fillRect/>
                     </a:stretch>
@@ -903,7 +2596,9 @@
     </w:p>
     <w:p>
       <w:r>
-        <w:lastRenderedPageBreak/>
+        <w:rPr>
+          <w:noProof/>
+        </w:rPr>
         <w:drawing>
           <wp:inline distT="0" distB="0" distL="0" distR="0" wp14:anchorId="0045085F" wp14:editId="2D9B0753">
             <wp:extent cx="5943600" cy="2360295"/>
@@ -920,7 +2615,7 @@
                     <pic:cNvPicPr/>
                   </pic:nvPicPr>
                   <pic:blipFill>
-                    <a:blip r:embed="rId16"/>
+                    <a:blip r:embed="rId15"/>
                     <a:stretch>
                       <a:fillRect/>
                     </a:stretch>
@@ -967,6 +2662,10 @@
     </w:p>
     <w:p>
       <w:r>
+        <w:rPr>
+          <w:noProof/>
+        </w:rPr>
+        <w:lastRenderedPageBreak/>
         <w:drawing>
           <wp:inline distT="0" distB="0" distL="0" distR="0" wp14:anchorId="385FC592" wp14:editId="01CFEC0C">
             <wp:extent cx="5943600" cy="3293745"/>
@@ -983,7 +2682,7 @@
                     <pic:cNvPicPr/>
                   </pic:nvPicPr>
                   <pic:blipFill>
-                    <a:blip r:embed="rId17"/>
+                    <a:blip r:embed="rId16"/>
                     <a:stretch>
                       <a:fillRect/>
                     </a:stretch>
@@ -1106,7 +2805,7 @@
         </w:numPr>
       </w:pPr>
       <w:r>
-        <w:t>Application developed successfully (Flask)</w:t>
+        <w:t xml:space="preserve">Application developed successfully </w:t>
       </w:r>
     </w:p>
     <w:p>
@@ -2046,6 +3745,7 @@
   <w:style w:type="character" w:default="1" w:styleId="DefaultParagraphFont">
     <w:name w:val="Default Paragraph Font"/>
     <w:uiPriority w:val="1"/>
+    <w:semiHidden/>
     <w:unhideWhenUsed/>
   </w:style>
   <w:style w:type="table" w:default="1" w:styleId="TableNormal">

</xml_diff>